<commit_message>
docs(marketing): put the Night of Excellence back in the spring table
Peter, 16 October 2026: the toolkit is read by tenants, not customers,
so Greene King's own awards night belongs in it. The row suggests AI
for a first draft of an entry from the tenant's own notes, and tells
readers to ask their BDM when entries close, because the 2027 entry
dates are not published. The website guide stays general.

Co-Authored-By: Claude Opus 5.5 <noreply@anthropic.com>
</commit_message>
<xml_diff>
--- a/marketing/greene-king-spring-2027/Greene King Spring Toolkit 2027 - Plan your spring in an afternoon.docx
+++ b/marketing/greene-king-spring-2027/Greene King Spring Toolkit 2027 - Plan your spring in an afternoon.docx
@@ -61,7 +61,7 @@
         </w:numPr>
       </w:pPr>
       <w:r>
-        <w:t xml:space="preserve">Two dates from your list are left out of our table. 7 April is National Beer Day in the United States; the UK’s Beer Day Britain is on 15 June. The Night of Excellence on 6 April is Greene King’s own awards night rather than a date for customers. Happy to add either back if you would like them in.</w:t>
+        <w:t xml:space="preserve">One date from your list is left out of our table: 7 April is National Beer Day in the United States, and the UK’s Beer Day Britain is on 15 June. Happy to add it back if you would like it in.</w:t>
       </w:r>
     </w:p>
     <w:p>
@@ -109,7 +109,7 @@
         </w:numPr>
       </w:pPr>
       <w:r>
-        <w:t xml:space="preserve">It runs to about 1,050 words across the two pages, including the table. If it is too long for the template, tell me which page is tight and I will trim it.</w:t>
+        <w:t xml:space="preserve">It runs to about 1,080 words across the two pages, including the table. If it is too long for the template, tell me which page is tight and I will trim it.</w:t>
       </w:r>
     </w:p>
     <w:bookmarkEnd w:id="9"/>
@@ -804,6 +804,41 @@
             </w:pPr>
             <w:r>
               <w:t xml:space="preserve">A tasting card for a whisky flight</w:t>
+            </w:r>
+          </w:p>
+        </w:tc>
+      </w:tr>
+      <w:tr>
+        <w:tc>
+          <w:tcPr/>
+          <w:p>
+            <w:pPr>
+              <w:pStyle w:val="Compact"/>
+            </w:pPr>
+            <w:r>
+              <w:t xml:space="preserve">Tue 6 Apr</w:t>
+            </w:r>
+          </w:p>
+        </w:tc>
+        <w:tc>
+          <w:tcPr/>
+          <w:p>
+            <w:pPr>
+              <w:pStyle w:val="Compact"/>
+            </w:pPr>
+            <w:r>
+              <w:t xml:space="preserve">Night of Excellence</w:t>
+            </w:r>
+          </w:p>
+        </w:tc>
+        <w:tc>
+          <w:tcPr/>
+          <w:p>
+            <w:pPr>
+              <w:pStyle w:val="Compact"/>
+            </w:pPr>
+            <w:r>
+              <w:t xml:space="preserve">A first draft of your awards entry, from your own notes. Ask your BDM when entries close</w:t>
             </w:r>
           </w:p>
         </w:tc>

</xml_diff>

<commit_message>
fix(marketing): current logo, Peter's new headshot and his own voice in the pack
Peter, 17 October 2026: the first pack carried the 2025 "OJ" logo
(public/logo.png), which was replaced by the orange-slice logo in
August. The pack now carries the colour and white horizontal logos from
public/brand/, and the new headshot he supplied (1254 px, for print).

The note to Charlotte and the designer notes now read as Peter wrote
them ("a photo of me", "call me"), because he sends them under his
name. Both corrections are recorded in tasks/lessons.md.

Co-Authored-By: Claude Opus 5.5 <noreply@anthropic.com>
</commit_message>
<xml_diff>
--- a/marketing/greene-king-spring-2027/Greene King Spring Toolkit 2027 - Plan your spring in an afternoon.docx
+++ b/marketing/greene-king-spring-2027/Greene King Spring Toolkit 2027 - Plan your spring in an afternoon.docx
@@ -16,7 +16,7 @@
         <w:pStyle w:val="FirstParagraph"/>
       </w:pPr>
       <w:r>
-        <w:t xml:space="preserve">Greene King Spring Toolkit, January to April 2027. Two pages for the toolkit template. First draft, 16 October 2026, from Peter Pitcher, Orange Jelly.</w:t>
+        <w:t xml:space="preserve">Greene King Spring Toolkit, January to April 2027. Two pages for your toolkit template. First draft, 17 October 2026.</w:t>
       </w:r>
     </w:p>
     <w:bookmarkStart w:id="9" w:name="note-for-charlotte-not-for-print"/>
@@ -37,7 +37,7 @@
         </w:numPr>
       </w:pPr>
       <w:r>
-        <w:t xml:space="preserve">Notes for the designer are in italics. They are not for print.</w:t>
+        <w:t xml:space="preserve">My notes for your designer are in italics. They are not for print.</w:t>
       </w:r>
     </w:p>
     <w:p>
@@ -49,7 +49,7 @@
         </w:numPr>
       </w:pPr>
       <w:r>
-        <w:t xml:space="preserve">The QR code is shown on page 2 and attached as QR-code-spring-guide.png. It opens the full guide on orangejelly.co.uk, which will be live before the toolkit goes out. Print it at least 20 mm square (25 mm is better), black on white, with its white border.</w:t>
+        <w:t xml:space="preserve">The QR code is on page 2, and I’ve attached it as QR-code-spring-guide.png. It opens my full guide on orangejelly.co.uk, which will be live before the toolkit goes out. Please print it at least 20 mm square (25 mm is better), black on white, with its white border.</w:t>
       </w:r>
     </w:p>
     <w:p>
@@ -61,7 +61,7 @@
         </w:numPr>
       </w:pPr>
       <w:r>
-        <w:t xml:space="preserve">Also attached: the Orange Jelly logo (Orange-Jelly-logo.png) for the Orange Jelly box, and a photo of Peter for the byline (Peter-Pitcher-headshot.jpg).</w:t>
+        <w:t xml:space="preserve">I’ve also attached our logo for the Orange Jelly box (Orange-Jelly-logo.png, with a white version, Orange-Jelly-logo-white.png, for a dark or orange background) and a photo of me for the byline (Peter-Pitcher-headshot.jpg).</w:t>
       </w:r>
     </w:p>
     <w:p>
@@ -73,7 +73,7 @@
         </w:numPr>
       </w:pPr>
       <w:r>
-        <w:t xml:space="preserve">One date from your list is left out of our table: 7 April is National Beer Day in the United States, and the UK’s Beer Day Britain is on 15 June. Happy to add it back if you would like it in.</w:t>
+        <w:t xml:space="preserve">I’ve left one date from your list out of the table: 7 April is National Beer Day in the United States, and the UK’s Beer Day Britain is on 15 June. Happy to add it back if you’d like it in.</w:t>
       </w:r>
     </w:p>
     <w:p>
@@ -85,7 +85,7 @@
         </w:numPr>
       </w:pPr>
       <w:r>
-        <w:t xml:space="preserve">Every other date was checked on 16 October 2026: the Six Nations fixtures against the official announcements, bank holidays against GOV.UK, and Mother’s Day and Easter from the 2027 Easter date.</w:t>
+        <w:t xml:space="preserve">I checked every other date on 16 October 2026: the Six Nations fixtures against the official announcements, the bank holidays against GOV.UK, and Mother’s Day and Easter from the 2027 Easter date.</w:t>
       </w:r>
     </w:p>
     <w:p>
@@ -109,7 +109,7 @@
         <w:t xml:space="preserve"> </w:t>
       </w:r>
       <w:r>
-        <w:t xml:space="preserve">box come from legislation.gov.uk and GOV.UK. The full guide lists every source.</w:t>
+        <w:t xml:space="preserve">box come from legislation.gov.uk and GOV.UK, and the full guide lists every source.</w:t>
       </w:r>
     </w:p>
     <w:p>
@@ -121,7 +121,7 @@
         </w:numPr>
       </w:pPr>
       <w:r>
-        <w:t xml:space="preserve">It runs to about 1,070 words across the two pages, including the table. If it is too long for the template, tell me which page is tight and I will trim it.</w:t>
+        <w:t xml:space="preserve">It runs to about 1,070 words across the two pages, including the table. If it’s too long for the template, tell me which page is tight and I’ll trim it.</w:t>
       </w:r>
     </w:p>
     <w:bookmarkEnd w:id="9"/>
@@ -188,7 +188,7 @@
           <w:i/>
           <w:iCs/>
         </w:rPr>
-        <w:t xml:space="preserve">Byline, with the photo of Peter (attached file Peter-Pitcher-headshot.jpg):</w:t>
+        <w:t xml:space="preserve">Byline, with my photo (attached file Peter-Pitcher-headshot.jpg):</w:t>
       </w:r>
     </w:p>
     <w:p>
@@ -1268,7 +1268,7 @@
           <w:i/>
           <w:iCs/>
         </w:rPr>
-        <w:t xml:space="preserve">Orange Jelly box, kept visually separate from the article, with the Orange Jelly logo (attached file Orange-Jelly-logo.png):</w:t>
+        <w:t xml:space="preserve">Orange Jelly box, kept visually separate from the article, with our logo (attached file Orange-Jelly-logo.png, or Orange-Jelly-logo-white.png on a dark or orange background):</w:t>
       </w:r>
     </w:p>
     <w:bookmarkEnd w:id="20"/>
@@ -1294,7 +1294,7 @@
         <w:pStyle w:val="BodyText"/>
       </w:pPr>
       <w:r>
-        <w:t xml:space="preserve">If you are ready for change, call Peter on 07990 587315 or email peter@orangejelly.co.uk.</w:t>
+        <w:t xml:space="preserve">If you are ready for change, call me on 07990 587315 or email peter@orangejelly.co.uk.</w:t>
       </w:r>
     </w:p>
     <w:p>

</xml_diff>